<commit_message>
Avance 2: microservicios, web integrado, pruebas, evidencias, documento y presentación
</commit_message>
<xml_diff>
--- a/docs/AbastoRed_Equipo01_Documento_Tecnico.docx
+++ b/docs/AbastoRed_Equipo01_Documento_Tecnico.docx
@@ -35269,7 +35269,7 @@
                 <w:b w:val="0"/>
                 <w:sz w:val="18"/>
               </w:rPr>
-              <w:t>OpenAPI 3.1 generado del código; Swagger UI sin internet en /docs.</w:t>
+              <w:t>OpenAPI 3.0.3 generado del código; Swagger UI sin internet en /docs.</w:t>
             </w:r>
           </w:p>
         </w:tc>
@@ -35399,7 +35399,7 @@
                 <w:b w:val="0"/>
                 <w:sz w:val="18"/>
               </w:rPr>
-              <w:t>82 unitarias y 77 de integración encadenadas (proceso completo, seguridad, contratos, Redis/MongoDB, recuperación ante fallas).</w:t>
+              <w:t>82 unitarias y 84 de integración encadenadas (proceso completo, seguridad, contratos, Redis/MongoDB, recuperación ante fallas).</w:t>
             </w:r>
           </w:p>
         </w:tc>
@@ -59904,7 +59904,7 @@
                 <w:b w:val="0"/>
                 <w:sz w:val="18"/>
               </w:rPr>
-              <w:t>32</w:t>
+              <w:t>39</w:t>
             </w:r>
           </w:p>
         </w:tc>
@@ -60076,13 +60076,13 @@
         <w:rPr>
           <w:b/>
         </w:rPr>
-        <w:t>159 pruebas aprobadas</w:t>
+        <w:t>166 pruebas aprobadas</w:t>
       </w:r>
       <w:r>
         <w:rPr>
           <w:b w:val="0"/>
         </w:rPr>
-        <w:t xml:space="preserve"> (82 unitarias y 77 de integración). Además, </w:t>
+        <w:t xml:space="preserve"> (82 unitarias y 84 de integración). Además, </w:t>
       </w:r>
       <w:r>
         <w:rPr>

</xml_diff>